<commit_message>
Add/update ind data for UWTranslationNotes
</commit_message>
<xml_diff>
--- a/ind/docx/40.content.docx
+++ b/ind/docx/40.content.docx
@@ -13071,19 +13071,7 @@
         <w:rPr>
           <w:lang w:val="id_ID" w:bidi="id_ID"/>
         </w:rPr>
-        <w:t xml:space="preserve"> adalah cara yang biasa untuk menunjukkan sebuah kutipan dari teks yang penting, dalam hal ini, kitab Perjanjian Lama yang ditulis oleh nabi Yesaya (lihat </w:t>
-      </w:r>
-      <w:r>
-        <w:rPr>
-          <w:lang w:val="id_ID" w:bidi="id_ID"/>
-        </w:rPr>
-        <w:t>7:14</w:t>
-      </w:r>
-      <w:r>
-        <w:rPr>
-          <w:lang w:val="id_ID" w:bidi="id_ID"/>
-        </w:rPr>
-        <w:t>). Jika berguna dalam bahasa Anda, Anda dapat menggunakan frasa sebanding yang menunjukkan bahwa kitab Matius mengutip dari sebuah teks yang penting. Terjemahan alternatif: “yang ditulis dalam kitab Yesaya” atau “yang menyatakan”</w:t>
+        <w:t xml:space="preserve"> adalah cara yang biasa untuk menunjukkan sebuah kutipan dari teks yang penting, dalam hal ini, kitab Perjanjian Lama yang ditulis oleh nabi Yesaya (lihat 7:14). Jika berguna dalam bahasa Anda, Anda dapat menggunakan frasa sebanding yang menunjukkan bahwa kitab Matius mengutip dari sebuah teks yang penting. Terjemahan alternatif: “yang ditulis dalam kitab Yesaya” atau “yang menyatakan”</w:t>
       </w:r>
     </w:p>
     <w:p>

</xml_diff>